<commit_message>
docs: fill the NAIC cover sheet and correct the batch endpoint claims
The root .docx had SOLUTION CATEGORY and SOLUTION blank. Both are now filled from verified repository state: the problem statement this build targets, the official checkpoints in the inference path, the live deployment and repository URLs, and the Track A affiliation. Also corrected 'Lingustics' to 'Linguistics' and the technical partner's name to match src/lib/natlas/attribution.ts.

asr-service/app.py and asr-service/README.md both claimed POST /transcribe/batch is what scripts/evaluate-asr.py uses for accuracy runs. It is not: the harness posts each clip to /transcribe separately so it can report progress per clip. Both documents now say so, and note that batch is an alternative to looping the single-clip endpoint. The batch endpoint does require the bearer token, matching /transcribe.
</commit_message>
<xml_diff>
--- a/N-Atlas National AI Competition - DeltaOS Core + AAUA.docx
+++ b/N-Atlas National AI Competition - DeltaOS Core + AAUA.docx
@@ -1,268 +1,5 @@
 
-<file path=word/document.xml><?xml version="1.0" encoding="utf-8"?>
-<w:document xmlns:wpc="http://schemas.microsoft.com/office/word/2010/wordprocessingCanvas" xmlns:mc="http://schemas.openxmlformats.org/markup-compatibility/2006" xmlns:o="urn:schemas-microsoft-com:office:office" xmlns:r="http://schemas.openxmlformats.org/officeDocument/2006/relationships" xmlns:m="http://schemas.openxmlformats.org/officeDocument/2006/math" xmlns:v="urn:schemas-microsoft-com:vml" xmlns:wp14="http://schemas.microsoft.com/office/word/2010/wordprocessingDrawing" xmlns:wp="http://schemas.openxmlformats.org/drawingml/2006/wordprocessingDrawing" xmlns:w10="urn:schemas-microsoft-com:office:word" xmlns:w="http://schemas.openxmlformats.org/wordprocessingml/2006/main" xmlns:w14="http://schemas.microsoft.com/office/word/2010/wordml" xmlns:w15="http://schemas.microsoft.com/office/word/2012/wordml" xmlns:wpg="http://schemas.microsoft.com/office/word/2010/wordprocessingGroup" xmlns:wpi="http://schemas.microsoft.com/office/word/2010/wordprocessingInk" xmlns:wne="http://schemas.microsoft.com/office/word/2006/wordml" xmlns:wps="http://schemas.microsoft.com/office/word/2010/wordprocessingShape">
-  <w:body>
-    <w:p>
-      <w:pPr>
-        <w:jc w:val="center"/>
-        <w:rPr>
-          <w:lang w:val="en-GB"/>
-          <w:b/>
-          <w:bCs/>
-          <w:sz w:val="28"/>
-          <w:szCs w:val="30"/>
-          <w:rtl w:val="off"/>
-        </w:rPr>
-      </w:pPr>
-      <w:r>
-        <w:rPr>
-          <w:lang w:val="en-GB"/>
-          <w:b/>
-          <w:bCs/>
-          <w:sz w:val="36"/>
-          <w:szCs w:val="38"/>
-          <w:rtl w:val="off"/>
-        </w:rPr>
-        <w:t>N-ATLAS - NATIONAL AI COMPETITION, 2026.</w:t>
-      </w:r>
-    </w:p>
-    <w:p>
-      <w:pPr>
-        <w:jc w:val="center"/>
-        <w:rPr>
-          <w:lang w:val="en-GB"/>
-          <w:b/>
-          <w:bCs/>
-          <w:sz w:val="28"/>
-          <w:szCs w:val="30"/>
-          <w:rtl w:val="off"/>
-        </w:rPr>
-      </w:pPr>
-    </w:p>
-    <w:p>
-      <w:pPr>
-        <w:jc w:val="both"/>
-        <w:rPr>
-          <w:lang w:val="en-GB"/>
-          <w:b/>
-          <w:bCs/>
-          <w:rtl w:val="off"/>
-        </w:rPr>
-      </w:pPr>
-      <w:r>
-        <w:rPr>
-          <w:lang w:val="en-GB"/>
-          <w:b/>
-          <w:bCs/>
-          <w:rtl w:val="off"/>
-        </w:rPr>
-        <w:t>ACADEMIC PARTNER</w:t>
-      </w:r>
-    </w:p>
-    <w:p>
-      <w:pPr>
-        <w:jc w:val="both"/>
-        <w:rPr>
-          <w:lang w:val="en-GB"/>
-          <w:rtl w:val="off"/>
-        </w:rPr>
-      </w:pPr>
-      <w:r>
-        <w:rPr>
-          <w:lang w:val="en-GB"/>
-          <w:rtl w:val="off"/>
-        </w:rPr>
-        <w:t>Adekunle Ajasin University, Akungba-Akoko</w:t>
-      </w:r>
-    </w:p>
-    <w:p>
-      <w:pPr>
-        <w:jc w:val="both"/>
-        <w:rPr>
-          <w:lang w:val="en-GB"/>
-          <w:rtl w:val="off"/>
-        </w:rPr>
-      </w:pPr>
-      <w:r>
-        <w:rPr>
-          <w:lang w:val="en-GB"/>
-          <w:rtl w:val="off"/>
-        </w:rPr>
-        <w:t>Department of Lingustics &amp; Languages</w:t>
-      </w:r>
-    </w:p>
-    <w:p>
-      <w:pPr>
-        <w:jc w:val="both"/>
-        <w:rPr>
-          <w:lang w:val="en-GB"/>
-          <w:rtl w:val="off"/>
-        </w:rPr>
-      </w:pPr>
-      <w:r>
-        <w:rPr>
-          <w:lang w:val="en-GB"/>
-          <w:rtl w:val="off"/>
-        </w:rPr>
-        <w:t>Prof. Simeon Olaogun</w:t>
-      </w:r>
-    </w:p>
-    <w:p>
-      <w:pPr>
-        <w:jc w:val="both"/>
-        <w:rPr>
-          <w:lang w:val="en-GB"/>
-          <w:rtl w:val="off"/>
-        </w:rPr>
-      </w:pPr>
-    </w:p>
-    <w:p>
-      <w:pPr>
-        <w:jc w:val="both"/>
-        <w:rPr>
-          <w:lang w:val="en-GB"/>
-          <w:b/>
-          <w:bCs/>
-          <w:rtl w:val="off"/>
-        </w:rPr>
-      </w:pPr>
-      <w:r>
-        <w:rPr>
-          <w:lang w:val="en-GB"/>
-          <w:b/>
-          <w:bCs/>
-          <w:rtl w:val="off"/>
-        </w:rPr>
-        <w:t>TECHNICAL PARTNER</w:t>
-      </w:r>
-    </w:p>
-    <w:p>
-      <w:pPr>
-        <w:jc w:val="both"/>
-        <w:rPr>
-          <w:lang w:val="en-GB"/>
-          <w:rtl w:val="off"/>
-        </w:rPr>
-      </w:pPr>
-      <w:r>
-        <w:rPr>
-          <w:lang w:val="en-GB"/>
-          <w:rtl w:val="off"/>
-        </w:rPr>
-        <w:t>DeltaOS Core</w:t>
-      </w:r>
-    </w:p>
-    <w:p>
-      <w:pPr>
-        <w:jc w:val="both"/>
-        <w:rPr>
-          <w:lang w:val="en-GB"/>
-          <w:rtl w:val="off"/>
-        </w:rPr>
-      </w:pPr>
-      <w:r>
-        <w:rPr>
-          <w:lang w:val="en-GB"/>
-          <w:rtl w:val="off"/>
-        </w:rPr>
-        <w:t>Oluwasanmi Adebowale</w:t>
-      </w:r>
-    </w:p>
-    <w:p>
-      <w:pPr>
-        <w:jc w:val="both"/>
-        <w:rPr>
-          <w:lang w:val="en-GB"/>
-          <w:rtl w:val="off"/>
-        </w:rPr>
-      </w:pPr>
-    </w:p>
-    <w:p>
-      <w:pPr>
-        <w:jc w:val="both"/>
-        <w:rPr>
-          <w:lang w:val="en-GB"/>
-          <w:b w:val="0"/>
-          <w:bCs w:val="0"/>
-          <w:rtl w:val="off"/>
-        </w:rPr>
-      </w:pPr>
-      <w:r>
-        <w:rPr>
-          <w:lang w:val="en-GB"/>
-          <w:b/>
-          <w:bCs/>
-          <w:rtl w:val="off"/>
-        </w:rPr>
-        <w:t>SOLUTION CATEGORY</w:t>
-      </w:r>
-      <w:r>
-        <w:rPr>
-          <w:lang w:val="en-GB"/>
-          <w:b w:val="0"/>
-          <w:bCs w:val="0"/>
-          <w:rtl w:val="off"/>
-        </w:rPr>
-        <w:t xml:space="preserve">: </w:t>
-      </w:r>
-    </w:p>
-    <w:p>
-      <w:pPr>
-        <w:jc w:val="both"/>
-        <w:rPr>
-          <w:lang w:val="en-GB"/>
-          <w:b w:val="0"/>
-          <w:bCs w:val="0"/>
-          <w:rtl w:val="off"/>
-        </w:rPr>
-      </w:pPr>
-    </w:p>
-    <w:p>
-      <w:pPr>
-        <w:jc w:val="both"/>
-        <w:rPr>
-          <w:lang w:val="en-GB"/>
-          <w:b w:val="0"/>
-          <w:bCs w:val="0"/>
-          <w:rtl w:val="off"/>
-        </w:rPr>
-      </w:pPr>
-    </w:p>
-    <w:p>
-      <w:pPr>
-        <w:jc w:val="both"/>
-        <w:rPr>
-          <w:b w:val="0"/>
-          <w:bCs w:val="0"/>
-        </w:rPr>
-      </w:pPr>
-      <w:r>
-        <w:rPr>
-          <w:lang w:val="en-GB"/>
-          <w:b/>
-          <w:bCs/>
-          <w:rtl w:val="off"/>
-        </w:rPr>
-        <w:t>SOLUTION</w:t>
-      </w:r>
-      <w:r>
-        <w:rPr>
-          <w:lang w:val="en-GB"/>
-          <w:b w:val="0"/>
-          <w:bCs w:val="0"/>
-          <w:rtl w:val="off"/>
-        </w:rPr>
-        <w:t xml:space="preserve">: </w:t>
-      </w:r>
-    </w:p>
-    <w:sectPr>
-      <w:pgSz w:w="12240" w:h="15840"/>
-      <w:pgMar w:top="1440" w:right="1440" w:bottom="1440" w:left="1440" w:header="720" w:footer="720" w:gutter="0"/>
-      <w:cols w:space="720"/>
-      <w:docGrid w:linePitch="360"/>
-    </w:sectPr>
-  </w:body>
-</w:document>
+<file path=word/document.xml><?xml version="1.0" encoding="UTF-8" standalone="yes"?><w:document  xmlns:wpc="http://schemas.microsoft.com/office/word/2010/wordprocessingCanvas" xmlns:mc="http://schemas.openxmlformats.org/markup-compatibility/2006" xmlns:o="urn:schemas-microsoft-com:office:office" xmlns:r="http://schemas.openxmlformats.org/officeDocument/2006/relationships" xmlns:m="http://schemas.openxmlformats.org/officeDocument/2006/math" xmlns:v="urn:schemas-microsoft-com:vml" xmlns:wp14="http://schemas.microsoft.com/office/word/2010/wordprocessingDrawing" xmlns:wp="http://schemas.openxmlformats.org/drawingml/2006/wordprocessingDrawing" xmlns:w10="urn:schemas-microsoft-com:office:word" xmlns:w="http://schemas.openxmlformats.org/wordprocessingml/2006/main" xmlns:w14="http://schemas.microsoft.com/office/word/2010/wordml" xmlns:w15="http://schemas.microsoft.com/office/word/2012/wordml" xmlns:wpg="http://schemas.microsoft.com/office/word/2010/wordprocessingGroup" xmlns:wpi="http://schemas.microsoft.com/office/word/2010/wordprocessingInk" xmlns:wne="http://schemas.microsoft.com/office/word/2006/wordml" xmlns:wps="http://schemas.microsoft.com/office/word/2010/wordprocessingShape"><w:body><w:p><w:pPr><w:jc w:val="center" /><w:rPr><w:lang w:val="en-GB"/><w:b /><w:bCs /><w:sz w:val="28" /><w:szCs w:val="30" /><w:rtl w:val="off"/></w:rPr></w:pPr><w:r><w:rPr><w:lang w:val="en-GB"/><w:b /><w:bCs /><w:sz w:val="36" /><w:szCs w:val="38" /><w:rtl w:val="off"/></w:rPr><w:t>N-ATLAS - NATIONAL AI COMPETITION, 2026.</w:t></w:r></w:p><w:p><w:pPr><w:jc w:val="center" /><w:rPr><w:lang w:val="en-GB"/><w:b /><w:bCs /><w:sz w:val="28" /><w:szCs w:val="30" /><w:rtl w:val="off"/></w:rPr></w:pPr></w:p><w:p><w:pPr><w:jc w:val="both" /><w:rPr><w:lang w:val="en-GB"/><w:b /><w:bCs /><w:rtl w:val="off"/></w:rPr></w:pPr><w:r><w:rPr><w:lang w:val="en-GB"/><w:b /><w:bCs /><w:rtl w:val="off"/></w:rPr><w:t>ACADEMIC PARTNER</w:t></w:r></w:p><w:p><w:pPr><w:jc w:val="both" /><w:rPr><w:lang w:val="en-GB"/><w:rtl w:val="off"/></w:rPr></w:pPr><w:r><w:rPr><w:lang w:val="en-GB"/><w:rtl w:val="off"/></w:rPr><w:t>Adekunle Ajasin University, Akungba-Akoko</w:t></w:r></w:p><w:p><w:pPr><w:jc w:val="both" /><w:rPr><w:lang w:val="en-GB"/><w:rtl w:val="off"/></w:rPr></w:pPr><w:r><w:rPr><w:lang w:val="en-GB"/><w:rtl w:val="off"/></w:rPr><w:t>Department of Linguistics &amp; Languages</w:t></w:r></w:p><w:p><w:pPr><w:jc w:val="both" /><w:rPr><w:lang w:val="en-GB"/><w:rtl w:val="off"/></w:rPr></w:pPr><w:r><w:rPr><w:lang w:val="en-GB"/><w:rtl w:val="off"/></w:rPr><w:t>Prof. Simeon Olaogun</w:t></w:r></w:p><w:p><w:pPr><w:jc w:val="both" /><w:rPr><w:lang w:val="en-GB"/><w:rtl w:val="off"/></w:rPr></w:pPr></w:p><w:p><w:pPr><w:jc w:val="both" /><w:rPr><w:lang w:val="en-GB"/><w:b /><w:bCs /><w:rtl w:val="off"/></w:rPr></w:pPr><w:r><w:rPr><w:lang w:val="en-GB"/><w:b /><w:bCs /><w:rtl w:val="off"/></w:rPr><w:t>TECHNICAL PARTNER</w:t></w:r></w:p><w:p><w:pPr><w:jc w:val="both" /><w:rPr><w:lang w:val="en-GB"/><w:rtl w:val="off"/></w:rPr></w:pPr><w:r><w:rPr><w:lang w:val="en-GB"/><w:rtl w:val="off"/></w:rPr><w:t>DeltaOS Core</w:t></w:r></w:p><w:p><w:pPr><w:jc w:val="both" /><w:rPr><w:lang w:val="en-GB"/><w:rtl w:val="off"/></w:rPr></w:pPr><w:r><w:rPr><w:lang w:val="en-GB"/><w:rtl w:val="off"/></w:rPr><w:t>Oluwasanmi Titus Adebowale</w:t></w:r></w:p><w:p><w:pPr><w:jc w:val="both" /><w:rPr><w:lang w:val="en-GB"/><w:rtl w:val="off"/></w:rPr></w:pPr></w:p><w:p><w:pPr><w:jc w:val="both" /><w:rPr><w:lang w:val="en-GB"/><w:b w:val="0" /><w:bCs w:val="0" /><w:rtl w:val="off"/></w:rPr></w:pPr><w:r><w:rPr><w:lang w:val="en-GB"/><w:b /><w:bCs /><w:rtl w:val="off"/></w:rPr><w:t>SOLUTION CATEGORY</w:t></w:r><w:r><w:rPr><w:lang w:val="en-GB"/><w:b w:val="0" /><w:bCs w:val="0" /><w:rtl w:val="off"/></w:rPr><w:t xml:space="preserve">: Voice-First Access (Problem Statement 02)</w:t></w:r></w:p><w:p><w:pPr><w:jc w:val="both" /><w:rPr><w:lang w:val="en-GB"/><w:b w:val="0" /><w:bCs w:val="0" /><w:rtl w:val="off"/></w:rPr></w:pPr></w:p><w:p><w:pPr><w:jc w:val="both" /><w:rPr><w:lang w:val="en-GB"/><w:b w:val="0" /><w:bCs w:val="0" /><w:rtl w:val="off"/></w:rPr></w:pPr></w:p><w:p><w:pPr><w:jc w:val="both" /><w:rPr><w:b w:val="0" /><w:bCs w:val="0" /></w:rPr></w:pPr><w:r><w:rPr><w:lang w:val="en-GB"/><w:b /><w:bCs /><w:rtl w:val="off"/></w:rPr><w:t>SOLUTION</w:t></w:r><w:r><w:rPr><w:lang w:val="en-GB"/><w:b w:val="0" /><w:bCs w:val="0" /><w:rtl w:val="off"/></w:rPr><w:t xml:space="preserve">: N-ATLaS Voice Tutor — a mobile-first web application in which a learner picks Hausa, Igbo or Yorúbá, presses one button and speaks. Speech is transcribed by the official N-ATLaS checkpoints NCAIR1/Hausa-ASR, NCAIR1/Igbo-ASR and NCAIR1/Yoruba-ASR; replies are generated by the official NCAIR1/N-ATLaS model, enforced at three independent points so no other model can be substituted. Deployed at https://n-atlas-voice-tutor-deltaos-core.vercel.app with source at https://github.com/sanmmie/n-atlas-voice-tutor. Submitted under Track A (Academia & Research) with the Department of Linguistics and Languages, Adekunle Ajasin University.</w:t></w:r></w:p><w:sectPr><w:pgSz w:w="12240" w:h="15840"/><w:pgMar w:top="1440" w:right="1440" w:bottom="1440" w:left="1440" w:header="720" w:footer="720" w:gutter="0"/><w:cols w:space="720"/><w:docGrid w:linePitch="360"/></w:sectPr></w:body></w:document>
 </file>
 
 <file path=word/styles.xml><?xml version="1.0" encoding="utf-8"?>

</xml_diff>